<commit_message>
Rebuild CIS PT-BR package with embedded figures
</commit_message>
<xml_diff>
--- a/01-foundations/CIS_Controls_v8.1/Portugues_BR/CIS_Critical_Security_Controls_v8.1_Practical_Manager_and_Junior_Analyst_Manual_Portugues_BR_v1.0.docx
+++ b/01-foundations/CIS_Controls_v8.1/Portugues_BR/CIS_Critical_Security_Controls_v8.1_Practical_Manager_and_Junior_Analyst_Manual_Portugues_BR_v1.0.docx
@@ -2,6 +2,32 @@
 <file path=word/document.xml><?xml version="1.0" encoding="utf-8"?>
 <w:document xmlns:w="http://schemas.openxmlformats.org/wordprocessingml/2006/main" xmlns:m="http://schemas.openxmlformats.org/officeDocument/2006/math" xmlns:r="http://schemas.openxmlformats.org/officeDocument/2006/relationships" xmlns:o="urn:schemas-microsoft-com:office:office" xmlns:v="urn:schemas-microsoft-com:vml" xmlns:w10="urn:schemas-microsoft-com:office:word" xmlns:a="http://schemas.openxmlformats.org/drawingml/2006/main" xmlns:pic="http://schemas.openxmlformats.org/drawingml/2006/picture" xmlns:wp="http://schemas.openxmlformats.org/drawingml/2006/wordprocessingDrawing">
   <w:body>
+    <w:sdt>
+      <w:sdtPr>
+        <w:docPartObj>
+          <w:docPartGallery w:val="Table of Contents"/>
+          <w:docPartUnique/>
+        </w:docPartObj>
+      </w:sdtPr>
+      <w:sdtContent>
+        <w:p>
+          <w:pPr>
+            <w:pStyle w:val="TOCHeading"/>
+          </w:pPr>
+          <w:r>
+            <w:t xml:space="preserve">Table of Contents</w:t>
+          </w:r>
+        </w:p>
+        <w:p>
+          <w:r>
+            <w:fldChar w:fldCharType="begin" w:dirty="true"/>
+            <w:instrText xml:space="preserve">TOC \o "1-3" \h \z \u</w:instrText>
+            <w:fldChar w:fldCharType="separate"/>
+            <w:fldChar w:fldCharType="end"/>
+          </w:r>
+        </w:p>
+      </w:sdtContent>
+    </w:sdt>
     <w:p>
       <w:pPr>
         <w:pStyle w:val="BlockText"/>
@@ -521,7 +547,7 @@
       </w:r>
     </w:p>
     <w:bookmarkEnd w:id="24"/>
-    <w:bookmarkStart w:id="25" w:name="fundamentos-dos-cis-controls-v8.1"/>
+    <w:bookmarkStart w:id="28" w:name="fundamentos-dos-cis-controls-v8.1"/>
     <w:p>
       <w:pPr>
         <w:pStyle w:val="Heading1"/>
@@ -544,8 +570,58 @@
     </w:p>
     <w:p>
       <w:pPr>
-        <w:pStyle w:val="BodyText"/>
-      </w:pPr>
+        <w:pStyle w:val="CaptionedFigure"/>
+      </w:pPr>
+      <w:r>
+        <w:drawing>
+          <wp:inline>
+            <wp:extent cx="5334000" cy="3418651"/>
+            <wp:effectExtent b="0" l="0" r="0" t="0"/>
+            <wp:docPr descr="Os Controles organizam 153 Salvaguardas em um programa defensivo prático." title="" id="26" name="Picture"/>
+            <a:graphic>
+              <a:graphicData uri="http://schemas.openxmlformats.org/drawingml/2006/picture">
+                <pic:pic>
+                  <pic:nvPicPr>
+                    <pic:cNvPr descr="media/image1.png" id="27" name="Picture"/>
+                    <pic:cNvPicPr>
+                      <a:picLocks noChangeArrowheads="1" noChangeAspect="1"/>
+                    </pic:cNvPicPr>
+                  </pic:nvPicPr>
+                  <pic:blipFill>
+                    <a:blip r:embed="rId25"/>
+                    <a:stretch>
+                      <a:fillRect/>
+                    </a:stretch>
+                  </pic:blipFill>
+                  <pic:spPr bwMode="auto">
+                    <a:xfrm>
+                      <a:off x="0" y="0"/>
+                      <a:ext cx="5334000" cy="3418651"/>
+                    </a:xfrm>
+                    <a:prstGeom prst="rect">
+                      <a:avLst/>
+                    </a:prstGeom>
+                    <a:noFill/>
+                    <a:ln w="9525">
+                      <a:noFill/>
+                      <a:headEnd/>
+                      <a:tailEnd/>
+                    </a:ln>
+                  </pic:spPr>
+                </pic:pic>
+              </a:graphicData>
+            </a:graphic>
+          </wp:inline>
+        </w:drawing>
+      </w:r>
+    </w:p>
+    <w:p>
+      <w:pPr>
+        <w:pStyle w:val="ImageCaption"/>
+      </w:pPr>
+      <w:r>
+        <w:t xml:space="preserve">Os Controles organizam 153 Salvaguardas em um programa defensivo prático.</w:t>
+      </w:r>
     </w:p>
     <w:p>
       <w:pPr>
@@ -824,8 +900,8 @@
         </w:tc>
       </w:tr>
     </w:tbl>
-    <w:bookmarkEnd w:id="25"/>
-    <w:bookmarkStart w:id="26" w:name="grupos-de-implementação-e-priorização"/>
+    <w:bookmarkEnd w:id="28"/>
+    <w:bookmarkStart w:id="32" w:name="grupos-de-implementação-e-priorização"/>
     <w:p>
       <w:pPr>
         <w:pStyle w:val="Heading1"/>
@@ -848,8 +924,58 @@
     </w:p>
     <w:p>
       <w:pPr>
-        <w:pStyle w:val="BodyText"/>
-      </w:pPr>
+        <w:pStyle w:val="CaptionedFigure"/>
+      </w:pPr>
+      <w:r>
+        <w:drawing>
+          <wp:inline>
+            <wp:extent cx="5334000" cy="2945452"/>
+            <wp:effectExtent b="0" l="0" r="0" t="0"/>
+            <wp:docPr descr="Cada Grupo de Implementação se apoia no grupo anterior; o IG3 contém todas as Salvaguardas." title="" id="30" name="Picture"/>
+            <a:graphic>
+              <a:graphicData uri="http://schemas.openxmlformats.org/drawingml/2006/picture">
+                <pic:pic>
+                  <pic:nvPicPr>
+                    <pic:cNvPr descr="media/image2.png" id="31" name="Picture"/>
+                    <pic:cNvPicPr>
+                      <a:picLocks noChangeArrowheads="1" noChangeAspect="1"/>
+                    </pic:cNvPicPr>
+                  </pic:nvPicPr>
+                  <pic:blipFill>
+                    <a:blip r:embed="rId29"/>
+                    <a:stretch>
+                      <a:fillRect/>
+                    </a:stretch>
+                  </pic:blipFill>
+                  <pic:spPr bwMode="auto">
+                    <a:xfrm>
+                      <a:off x="0" y="0"/>
+                      <a:ext cx="5334000" cy="2945452"/>
+                    </a:xfrm>
+                    <a:prstGeom prst="rect">
+                      <a:avLst/>
+                    </a:prstGeom>
+                    <a:noFill/>
+                    <a:ln w="9525">
+                      <a:noFill/>
+                      <a:headEnd/>
+                      <a:tailEnd/>
+                    </a:ln>
+                  </pic:spPr>
+                </pic:pic>
+              </a:graphicData>
+            </a:graphic>
+          </wp:inline>
+        </w:drawing>
+      </w:r>
+    </w:p>
+    <w:p>
+      <w:pPr>
+        <w:pStyle w:val="ImageCaption"/>
+      </w:pPr>
+      <w:r>
+        <w:t xml:space="preserve">Cada Grupo de Implementação se apoia no grupo anterior; o IG3 contém todas as Salvaguardas.</w:t>
+      </w:r>
     </w:p>
     <w:p>
       <w:pPr>
@@ -1136,8 +1262,8 @@
         <w:t xml:space="preserve">Utilize o CIS Controls Navigator oficial para filtrar as Salvaguardas v8.1 e consultar os mapeamentos.</w:t>
       </w:r>
     </w:p>
-    <w:bookmarkEnd w:id="26"/>
-    <w:bookmarkStart w:id="27" w:name="governança-escopo-e-responsabilidades"/>
+    <w:bookmarkEnd w:id="32"/>
+    <w:bookmarkStart w:id="33" w:name="governança-escopo-e-responsabilidades"/>
     <w:p>
       <w:pPr>
         <w:pStyle w:val="Heading1"/>
@@ -1491,8 +1617,8 @@
         </w:tc>
       </w:tr>
     </w:tbl>
-    <w:bookmarkEnd w:id="27"/>
-    <w:bookmarkStart w:id="28" w:name="Xc1dbbaed163de0e771631a46865d2ddbabfc7b2"/>
+    <w:bookmarkEnd w:id="33"/>
+    <w:bookmarkStart w:id="37" w:name="Xc1dbbaed163de0e771631a46865d2ddbabfc7b2"/>
     <w:p>
       <w:pPr>
         <w:pStyle w:val="Heading1"/>
@@ -1515,8 +1641,58 @@
     </w:p>
     <w:p>
       <w:pPr>
-        <w:pStyle w:val="BodyText"/>
-      </w:pPr>
+        <w:pStyle w:val="CaptionedFigure"/>
+      </w:pPr>
+      <w:r>
+        <w:drawing>
+          <wp:inline>
+            <wp:extent cx="5334000" cy="2497751"/>
+            <wp:effectExtent b="0" l="0" r="0" t="0"/>
+            <wp:docPr descr="A especificação oficial avança de entradas definidas para operações, medidas, métricas e revisão de procedimentos." title="" id="35" name="Picture"/>
+            <a:graphic>
+              <a:graphicData uri="http://schemas.openxmlformats.org/drawingml/2006/picture">
+                <pic:pic>
+                  <pic:nvPicPr>
+                    <pic:cNvPr descr="media/image3.png" id="36" name="Picture"/>
+                    <pic:cNvPicPr>
+                      <a:picLocks noChangeArrowheads="1" noChangeAspect="1"/>
+                    </pic:cNvPicPr>
+                  </pic:nvPicPr>
+                  <pic:blipFill>
+                    <a:blip r:embed="rId34"/>
+                    <a:stretch>
+                      <a:fillRect/>
+                    </a:stretch>
+                  </pic:blipFill>
+                  <pic:spPr bwMode="auto">
+                    <a:xfrm>
+                      <a:off x="0" y="0"/>
+                      <a:ext cx="5334000" cy="2497751"/>
+                    </a:xfrm>
+                    <a:prstGeom prst="rect">
+                      <a:avLst/>
+                    </a:prstGeom>
+                    <a:noFill/>
+                    <a:ln w="9525">
+                      <a:noFill/>
+                      <a:headEnd/>
+                      <a:tailEnd/>
+                    </a:ln>
+                  </pic:spPr>
+                </pic:pic>
+              </a:graphicData>
+            </a:graphic>
+          </wp:inline>
+        </w:drawing>
+      </w:r>
+    </w:p>
+    <w:p>
+      <w:pPr>
+        <w:pStyle w:val="ImageCaption"/>
+      </w:pPr>
+      <w:r>
+        <w:t xml:space="preserve">A especificação oficial avança de entradas definidas para operações, medidas, métricas e revisão de procedimentos.</w:t>
+      </w:r>
     </w:p>
     <w:p>
       <w:pPr>
@@ -1871,8 +2047,8 @@
         <w:t xml:space="preserve">Relate escopo, resultado, exceções, limitações, responsável, ação e data.</w:t>
       </w:r>
     </w:p>
-    <w:bookmarkEnd w:id="28"/>
-    <w:bookmarkStart w:id="29" w:name="roteiro-de-implementação"/>
+    <w:bookmarkEnd w:id="37"/>
+    <w:bookmarkStart w:id="38" w:name="roteiro-de-implementação"/>
     <w:p>
       <w:pPr>
         <w:pStyle w:val="Heading1"/>
@@ -2019,8 +2195,8 @@
         <w:t xml:space="preserve">Um conjunto menor de Salvaguardas, com escopo completo, operação consistente, medição e melhoria contínua, é mais defensável do que uma lista extensa marcada como concluída sem evidências confiáveis.</w:t>
       </w:r>
     </w:p>
-    <w:bookmarkEnd w:id="29"/>
-    <w:bookmarkStart w:id="30" w:name="X7695489a38f7c692e8afcb40666cce5b46824ac"/>
+    <w:bookmarkEnd w:id="38"/>
+    <w:bookmarkStart w:id="42" w:name="X7695489a38f7c692e8afcb40666cce5b46824ac"/>
     <w:p>
       <w:pPr>
         <w:pStyle w:val="Heading1"/>
@@ -2043,8 +2219,58 @@
     </w:p>
     <w:p>
       <w:pPr>
-        <w:pStyle w:val="BodyText"/>
-      </w:pPr>
+        <w:pStyle w:val="CaptionedFigure"/>
+      </w:pPr>
+      <w:r>
+        <w:drawing>
+          <wp:inline>
+            <wp:extent cx="5334000" cy="2940126"/>
+            <wp:effectExtent b="0" l="0" r="0" t="0"/>
+            <wp:docPr descr="Descoberta, conciliação, resposta e revisão mantêm atualizadas as populações fundamentais." title="" id="40" name="Picture"/>
+            <a:graphic>
+              <a:graphicData uri="http://schemas.openxmlformats.org/drawingml/2006/picture">
+                <pic:pic>
+                  <pic:nvPicPr>
+                    <pic:cNvPr descr="media/image4.png" id="41" name="Picture"/>
+                    <pic:cNvPicPr>
+                      <a:picLocks noChangeArrowheads="1" noChangeAspect="1"/>
+                    </pic:cNvPicPr>
+                  </pic:nvPicPr>
+                  <pic:blipFill>
+                    <a:blip r:embed="rId39"/>
+                    <a:stretch>
+                      <a:fillRect/>
+                    </a:stretch>
+                  </pic:blipFill>
+                  <pic:spPr bwMode="auto">
+                    <a:xfrm>
+                      <a:off x="0" y="0"/>
+                      <a:ext cx="5334000" cy="2940126"/>
+                    </a:xfrm>
+                    <a:prstGeom prst="rect">
+                      <a:avLst/>
+                    </a:prstGeom>
+                    <a:noFill/>
+                    <a:ln w="9525">
+                      <a:noFill/>
+                      <a:headEnd/>
+                      <a:tailEnd/>
+                    </a:ln>
+                  </pic:spPr>
+                </pic:pic>
+              </a:graphicData>
+            </a:graphic>
+          </wp:inline>
+        </w:drawing>
+      </w:r>
+    </w:p>
+    <w:p>
+      <w:pPr>
+        <w:pStyle w:val="ImageCaption"/>
+      </w:pPr>
+      <w:r>
+        <w:t xml:space="preserve">Descoberta, conciliação, resposta e revisão mantêm atualizadas as populações fundamentais.</w:t>
+      </w:r>
     </w:p>
     <w:p>
       <w:pPr>
@@ -2491,8 +2717,8 @@
         <w:t xml:space="preserve">Consulte os CIS Controls v8.1 e a CIS Controls Assessment Specification oficiais para confirmar linguagem exata, classe de ativo, função de segurança, Grupo de Implementação, dependências, entradas, operações, medidas, métricas e revisão de procedimentos.</w:t>
       </w:r>
     </w:p>
-    <w:bookmarkEnd w:id="30"/>
-    <w:bookmarkStart w:id="31" w:name="Xeb9b34ac7dc5be396e103312241fbdff6bec423"/>
+    <w:bookmarkEnd w:id="42"/>
+    <w:bookmarkStart w:id="43" w:name="Xeb9b34ac7dc5be396e103312241fbdff6bec423"/>
     <w:p>
       <w:pPr>
         <w:pStyle w:val="Heading1"/>
@@ -3074,8 +3300,8 @@
         <w:t xml:space="preserve">Consulte os recursos oficiais do CIS para confirmar a linguagem e os critérios de avaliação.</w:t>
       </w:r>
     </w:p>
-    <w:bookmarkEnd w:id="31"/>
-    <w:bookmarkStart w:id="32" w:name="controle-3-proteção-de-dados"/>
+    <w:bookmarkEnd w:id="43"/>
+    <w:bookmarkStart w:id="47" w:name="controle-3-proteção-de-dados"/>
     <w:p>
       <w:pPr>
         <w:pStyle w:val="Heading1"/>
@@ -3098,8 +3324,58 @@
     </w:p>
     <w:p>
       <w:pPr>
-        <w:pStyle w:val="BodyText"/>
-      </w:pPr>
+        <w:pStyle w:val="CaptionedFigure"/>
+      </w:pPr>
+      <w:r>
+        <w:drawing>
+          <wp:inline>
+            <wp:extent cx="5334000" cy="2945452"/>
+            <wp:effectExtent b="0" l="0" r="0" t="0"/>
+            <wp:docPr descr="Descobrir, classificar, proteger, reter e eliminar dados conforme sua sensibilidade e necessidade." title="" id="45" name="Picture"/>
+            <a:graphic>
+              <a:graphicData uri="http://schemas.openxmlformats.org/drawingml/2006/picture">
+                <pic:pic>
+                  <pic:nvPicPr>
+                    <pic:cNvPr descr="media/image5.png" id="46" name="Picture"/>
+                    <pic:cNvPicPr>
+                      <a:picLocks noChangeArrowheads="1" noChangeAspect="1"/>
+                    </pic:cNvPicPr>
+                  </pic:nvPicPr>
+                  <pic:blipFill>
+                    <a:blip r:embed="rId44"/>
+                    <a:stretch>
+                      <a:fillRect/>
+                    </a:stretch>
+                  </pic:blipFill>
+                  <pic:spPr bwMode="auto">
+                    <a:xfrm>
+                      <a:off x="0" y="0"/>
+                      <a:ext cx="5334000" cy="2945452"/>
+                    </a:xfrm>
+                    <a:prstGeom prst="rect">
+                      <a:avLst/>
+                    </a:prstGeom>
+                    <a:noFill/>
+                    <a:ln w="9525">
+                      <a:noFill/>
+                      <a:headEnd/>
+                      <a:tailEnd/>
+                    </a:ln>
+                  </pic:spPr>
+                </pic:pic>
+              </a:graphicData>
+            </a:graphic>
+          </wp:inline>
+        </w:drawing>
+      </w:r>
+    </w:p>
+    <w:p>
+      <w:pPr>
+        <w:pStyle w:val="ImageCaption"/>
+      </w:pPr>
+      <w:r>
+        <w:t xml:space="preserve">Descobrir, classificar, proteger, reter e eliminar dados conforme sua sensibilidade e necessidade.</w:t>
+      </w:r>
     </w:p>
     <w:p>
       <w:pPr>
@@ -4104,8 +4380,8 @@
         <w:t xml:space="preserve">Consulte os recursos oficiais do CIS para confirmar a linguagem e os critérios de avaliação.</w:t>
       </w:r>
     </w:p>
-    <w:bookmarkEnd w:id="32"/>
-    <w:bookmarkStart w:id="33" w:name="Xd2ef3f86512794823bc8b468f11f6ff2370559c"/>
+    <w:bookmarkEnd w:id="47"/>
+    <w:bookmarkStart w:id="48" w:name="Xd2ef3f86512794823bc8b468f11f6ff2370559c"/>
     <w:p>
       <w:pPr>
         <w:pStyle w:val="Heading1"/>
@@ -4997,8 +5273,8 @@
         <w:t xml:space="preserve">Consulte os recursos oficiais do CIS para confirmar a linguagem e os critérios de avaliação.</w:t>
       </w:r>
     </w:p>
-    <w:bookmarkEnd w:id="33"/>
-    <w:bookmarkStart w:id="34" w:name="controle-5-gestão-de-contas"/>
+    <w:bookmarkEnd w:id="48"/>
+    <w:bookmarkStart w:id="49" w:name="controle-5-gestão-de-contas"/>
     <w:p>
       <w:pPr>
         <w:pStyle w:val="Heading1"/>
@@ -5518,8 +5794,8 @@
         <w:t xml:space="preserve">Consulte os recursos oficiais do CIS para confirmar a linguagem e os critérios de avaliação.</w:t>
       </w:r>
     </w:p>
-    <w:bookmarkEnd w:id="34"/>
-    <w:bookmarkStart w:id="35" w:name="controle-6-gestão-do-controle-de-acesso"/>
+    <w:bookmarkEnd w:id="49"/>
+    <w:bookmarkStart w:id="53" w:name="controle-6-gestão-do-controle-de-acesso"/>
     <w:p>
       <w:pPr>
         <w:pStyle w:val="Heading1"/>
@@ -5542,8 +5818,58 @@
     </w:p>
     <w:p>
       <w:pPr>
-        <w:pStyle w:val="BodyText"/>
-      </w:pPr>
+        <w:pStyle w:val="CaptionedFigure"/>
+      </w:pPr>
+      <w:r>
+        <w:drawing>
+          <wp:inline>
+            <wp:extent cx="5334000" cy="2940126"/>
+            <wp:effectExtent b="0" l="0" r="0" t="0"/>
+            <wp:docPr descr="Contas e privilégios exigem concessão aprovada, autenticação forte, revisão e revogação tempestiva." title="" id="51" name="Picture"/>
+            <a:graphic>
+              <a:graphicData uri="http://schemas.openxmlformats.org/drawingml/2006/picture">
+                <pic:pic>
+                  <pic:nvPicPr>
+                    <pic:cNvPr descr="media/image6.png" id="52" name="Picture"/>
+                    <pic:cNvPicPr>
+                      <a:picLocks noChangeArrowheads="1" noChangeAspect="1"/>
+                    </pic:cNvPicPr>
+                  </pic:nvPicPr>
+                  <pic:blipFill>
+                    <a:blip r:embed="rId50"/>
+                    <a:stretch>
+                      <a:fillRect/>
+                    </a:stretch>
+                  </pic:blipFill>
+                  <pic:spPr bwMode="auto">
+                    <a:xfrm>
+                      <a:off x="0" y="0"/>
+                      <a:ext cx="5334000" cy="2940126"/>
+                    </a:xfrm>
+                    <a:prstGeom prst="rect">
+                      <a:avLst/>
+                    </a:prstGeom>
+                    <a:noFill/>
+                    <a:ln w="9525">
+                      <a:noFill/>
+                      <a:headEnd/>
+                      <a:tailEnd/>
+                    </a:ln>
+                  </pic:spPr>
+                </pic:pic>
+              </a:graphicData>
+            </a:graphic>
+          </wp:inline>
+        </w:drawing>
+      </w:r>
+    </w:p>
+    <w:p>
+      <w:pPr>
+        <w:pStyle w:val="ImageCaption"/>
+      </w:pPr>
+      <w:r>
+        <w:t xml:space="preserve">Contas e privilégios exigem concessão aprovada, autenticação forte, revisão e revogação tempestiva.</w:t>
+      </w:r>
     </w:p>
     <w:p>
       <w:pPr>
@@ -6176,8 +6502,8 @@
         <w:t xml:space="preserve">Consulte os recursos oficiais do CIS para confirmar a linguagem exata e os critérios de avaliação.</w:t>
       </w:r>
     </w:p>
-    <w:bookmarkEnd w:id="35"/>
-    <w:bookmarkStart w:id="36" w:name="X06fea277411b6ffc3a6398f4e21a06270df3ac3"/>
+    <w:bookmarkEnd w:id="53"/>
+    <w:bookmarkStart w:id="57" w:name="X06fea277411b6ffc3a6398f4e21a06270df3ac3"/>
     <w:p>
       <w:pPr>
         <w:pStyle w:val="Heading1"/>
@@ -6200,8 +6526,58 @@
     </w:p>
     <w:p>
       <w:pPr>
-        <w:pStyle w:val="BodyText"/>
-      </w:pPr>
+        <w:pStyle w:val="CaptionedFigure"/>
+      </w:pPr>
+      <w:r>
+        <w:drawing>
+          <wp:inline>
+            <wp:extent cx="5334000" cy="2945452"/>
+            <wp:effectExtent b="0" l="0" r="0" t="0"/>
+            <wp:docPr descr="Cobertura completa e remediação verificada importam mais do que apenas produzir relatórios de varredura." title="" id="55" name="Picture"/>
+            <a:graphic>
+              <a:graphicData uri="http://schemas.openxmlformats.org/drawingml/2006/picture">
+                <pic:pic>
+                  <pic:nvPicPr>
+                    <pic:cNvPr descr="media/image7.png" id="56" name="Picture"/>
+                    <pic:cNvPicPr>
+                      <a:picLocks noChangeArrowheads="1" noChangeAspect="1"/>
+                    </pic:cNvPicPr>
+                  </pic:nvPicPr>
+                  <pic:blipFill>
+                    <a:blip r:embed="rId54"/>
+                    <a:stretch>
+                      <a:fillRect/>
+                    </a:stretch>
+                  </pic:blipFill>
+                  <pic:spPr bwMode="auto">
+                    <a:xfrm>
+                      <a:off x="0" y="0"/>
+                      <a:ext cx="5334000" cy="2945452"/>
+                    </a:xfrm>
+                    <a:prstGeom prst="rect">
+                      <a:avLst/>
+                    </a:prstGeom>
+                    <a:noFill/>
+                    <a:ln w="9525">
+                      <a:noFill/>
+                      <a:headEnd/>
+                      <a:tailEnd/>
+                    </a:ln>
+                  </pic:spPr>
+                </pic:pic>
+              </a:graphicData>
+            </a:graphic>
+          </wp:inline>
+        </w:drawing>
+      </w:r>
+    </w:p>
+    <w:p>
+      <w:pPr>
+        <w:pStyle w:val="ImageCaption"/>
+      </w:pPr>
+      <w:r>
+        <w:t xml:space="preserve">Cobertura completa e remediação verificada importam mais do que apenas produzir relatórios de varredura.</w:t>
+      </w:r>
     </w:p>
     <w:p>
       <w:pPr>
@@ -6772,8 +7148,8 @@
         <w:t xml:space="preserve">Consulte os recursos oficiais do CIS para confirmar a linguagem exata e os critérios de avaliação.</w:t>
       </w:r>
     </w:p>
-    <w:bookmarkEnd w:id="36"/>
-    <w:bookmarkStart w:id="37" w:name="Xf50acdf6cf87cfad2b73b5a64dfca01a425ab8c"/>
+    <w:bookmarkEnd w:id="57"/>
+    <w:bookmarkStart w:id="58" w:name="Xf50acdf6cf87cfad2b73b5a64dfca01a425ab8c"/>
     <w:p>
       <w:pPr>
         <w:pStyle w:val="Heading1"/>
@@ -7665,8 +8041,8 @@
         <w:t xml:space="preserve">Consulte os recursos oficiais do CIS para confirmar a linguagem exata e os critérios de avaliação.</w:t>
       </w:r>
     </w:p>
-    <w:bookmarkEnd w:id="37"/>
-    <w:bookmarkStart w:id="38" w:name="X5100dd7fcf7dc021ae0a986a36f75dd228b1ca4"/>
+    <w:bookmarkEnd w:id="58"/>
+    <w:bookmarkStart w:id="59" w:name="X5100dd7fcf7dc021ae0a986a36f75dd228b1ca4"/>
     <w:p>
       <w:pPr>
         <w:pStyle w:val="Heading1"/>
@@ -8248,8 +8624,8 @@
         <w:t xml:space="preserve">Consulte os recursos oficiais do CIS para confirmar a linguagem exata e os critérios de avaliação.</w:t>
       </w:r>
     </w:p>
-    <w:bookmarkEnd w:id="38"/>
-    <w:bookmarkStart w:id="39" w:name="controle-10-defesas-contra-malware"/>
+    <w:bookmarkEnd w:id="59"/>
+    <w:bookmarkStart w:id="60" w:name="controle-10-defesas-contra-malware"/>
     <w:p>
       <w:pPr>
         <w:pStyle w:val="Heading1"/>
@@ -8831,8 +9207,8 @@
         <w:t xml:space="preserve">Consulte os recursos oficiais do CIS para confirmar a linguagem exata e os critérios de avaliação.</w:t>
       </w:r>
     </w:p>
-    <w:bookmarkEnd w:id="39"/>
-    <w:bookmarkStart w:id="40" w:name="controle-11-recuperação-de-dados"/>
+    <w:bookmarkEnd w:id="60"/>
+    <w:bookmarkStart w:id="61" w:name="controle-11-recuperação-de-dados"/>
     <w:p>
       <w:pPr>
         <w:pStyle w:val="Heading1"/>
@@ -9290,8 +9666,8 @@
         <w:t xml:space="preserve">Consulte os recursos oficiais do CIS para confirmar a linguagem e os critérios de avaliação.</w:t>
       </w:r>
     </w:p>
-    <w:bookmarkEnd w:id="40"/>
-    <w:bookmarkStart w:id="41" w:name="Xb5da36bf35d28041e8e7b72cd668c85f337adb5"/>
+    <w:bookmarkEnd w:id="61"/>
+    <w:bookmarkStart w:id="62" w:name="Xb5da36bf35d28041e8e7b72cd668c85f337adb5"/>
     <w:p>
       <w:pPr>
         <w:pStyle w:val="Heading1"/>
@@ -9935,8 +10311,8 @@
         <w:t xml:space="preserve">Consulte os recursos oficiais do CIS para confirmar a linguagem e os critérios de avaliação.</w:t>
       </w:r>
     </w:p>
-    <w:bookmarkEnd w:id="41"/>
-    <w:bookmarkStart w:id="42" w:name="Xeb29bc4cc2ef7fd4525419f520e091c8152fe8b"/>
+    <w:bookmarkEnd w:id="62"/>
+    <w:bookmarkStart w:id="66" w:name="Xeb29bc4cc2ef7fd4525419f520e091c8152fe8b"/>
     <w:p>
       <w:pPr>
         <w:pStyle w:val="Heading1"/>
@@ -9959,8 +10335,58 @@
     </w:p>
     <w:p>
       <w:pPr>
-        <w:pStyle w:val="BodyText"/>
-      </w:pPr>
+        <w:pStyle w:val="CaptionedFigure"/>
+      </w:pPr>
+      <w:r>
+        <w:drawing>
+          <wp:inline>
+            <wp:extent cx="5334000" cy="2940204"/>
+            <wp:effectExtent b="0" l="0" r="0" t="0"/>
+            <wp:docPr descr="Contexto centralizado, detecção ajustada, investigação humana e resposta formam uma defesa útil." title="" id="64" name="Picture"/>
+            <a:graphic>
+              <a:graphicData uri="http://schemas.openxmlformats.org/drawingml/2006/picture">
+                <pic:pic>
+                  <pic:nvPicPr>
+                    <pic:cNvPr descr="media/image8.png" id="65" name="Picture"/>
+                    <pic:cNvPicPr>
+                      <a:picLocks noChangeArrowheads="1" noChangeAspect="1"/>
+                    </pic:cNvPicPr>
+                  </pic:nvPicPr>
+                  <pic:blipFill>
+                    <a:blip r:embed="rId63"/>
+                    <a:stretch>
+                      <a:fillRect/>
+                    </a:stretch>
+                  </pic:blipFill>
+                  <pic:spPr bwMode="auto">
+                    <a:xfrm>
+                      <a:off x="0" y="0"/>
+                      <a:ext cx="5334000" cy="2940204"/>
+                    </a:xfrm>
+                    <a:prstGeom prst="rect">
+                      <a:avLst/>
+                    </a:prstGeom>
+                    <a:noFill/>
+                    <a:ln w="9525">
+                      <a:noFill/>
+                      <a:headEnd/>
+                      <a:tailEnd/>
+                    </a:ln>
+                  </pic:spPr>
+                </pic:pic>
+              </a:graphicData>
+            </a:graphic>
+          </wp:inline>
+        </w:drawing>
+      </w:r>
+    </w:p>
+    <w:p>
+      <w:pPr>
+        <w:pStyle w:val="ImageCaption"/>
+      </w:pPr>
+      <w:r>
+        <w:t xml:space="preserve">Contexto centralizado, detecção ajustada, investigação humana e resposta formam uma defesa útil.</w:t>
+      </w:r>
     </w:p>
     <w:p>
       <w:pPr>
@@ -10779,8 +11205,8 @@
         <w:t xml:space="preserve">Consulte os recursos oficiais do CIS para confirmar a linguagem e os critérios de avaliação.</w:t>
       </w:r>
     </w:p>
-    <w:bookmarkEnd w:id="42"/>
-    <w:bookmarkStart w:id="43" w:name="Xfb1eb4229f290d0077d5aaba6df091b0bbbd9d2"/>
+    <w:bookmarkEnd w:id="66"/>
+    <w:bookmarkStart w:id="67" w:name="Xfb1eb4229f290d0077d5aaba6df091b0bbbd9d2"/>
     <w:p>
       <w:pPr>
         <w:pStyle w:val="Heading1"/>
@@ -11486,8 +11912,8 @@
         <w:t xml:space="preserve">Consulte os recursos oficiais do CIS para confirmar a linguagem e os critérios de avaliação.</w:t>
       </w:r>
     </w:p>
-    <w:bookmarkEnd w:id="43"/>
-    <w:bookmarkStart w:id="44" w:name="Xd49ca9d8e48ed88f948967f818255b91d398ae1"/>
+    <w:bookmarkEnd w:id="67"/>
+    <w:bookmarkStart w:id="68" w:name="Xd49ca9d8e48ed88f948967f818255b91d398ae1"/>
     <w:p>
       <w:pPr>
         <w:pStyle w:val="Heading1"/>
@@ -12069,8 +12495,8 @@
         <w:t xml:space="preserve">Consulte os recursos oficiais do CIS para confirmar a linguagem e os critérios de avaliação.</w:t>
       </w:r>
     </w:p>
-    <w:bookmarkEnd w:id="44"/>
-    <w:bookmarkStart w:id="45" w:name="X462f3600ff91c676cd671f9a1a14212099b1516"/>
+    <w:bookmarkEnd w:id="68"/>
+    <w:bookmarkStart w:id="69" w:name="X462f3600ff91c676cd671f9a1a14212099b1516"/>
     <w:p>
       <w:pPr>
         <w:pStyle w:val="Heading1"/>
@@ -13086,8 +13512,8 @@
         <w:t xml:space="preserve">Consulte os recursos oficiais do CIS para confirmar a linguagem e os critérios de avaliação.</w:t>
       </w:r>
     </w:p>
-    <w:bookmarkEnd w:id="45"/>
-    <w:bookmarkStart w:id="46" w:name="Xc7e995b8751e7ae11487ec0fa10a86b26efc2b5"/>
+    <w:bookmarkEnd w:id="69"/>
+    <w:bookmarkStart w:id="73" w:name="Xc7e995b8751e7ae11487ec0fa10a86b26efc2b5"/>
     <w:p>
       <w:pPr>
         <w:pStyle w:val="Heading1"/>
@@ -13110,8 +13536,58 @@
     </w:p>
     <w:p>
       <w:pPr>
-        <w:pStyle w:val="BodyText"/>
-      </w:pPr>
+        <w:pStyle w:val="CaptionedFigure"/>
+      </w:pPr>
+      <w:r>
+        <w:drawing>
+          <wp:inline>
+            <wp:extent cx="5334000" cy="2945452"/>
+            <wp:effectExtent b="0" l="0" r="0" t="0"/>
+            <wp:docPr descr="Papéis, comunicação, exercícios e revisões mantêm a resposta a incidentes preparada." title="" id="71" name="Picture"/>
+            <a:graphic>
+              <a:graphicData uri="http://schemas.openxmlformats.org/drawingml/2006/picture">
+                <pic:pic>
+                  <pic:nvPicPr>
+                    <pic:cNvPr descr="media/image9.png" id="72" name="Picture"/>
+                    <pic:cNvPicPr>
+                      <a:picLocks noChangeArrowheads="1" noChangeAspect="1"/>
+                    </pic:cNvPicPr>
+                  </pic:nvPicPr>
+                  <pic:blipFill>
+                    <a:blip r:embed="rId70"/>
+                    <a:stretch>
+                      <a:fillRect/>
+                    </a:stretch>
+                  </pic:blipFill>
+                  <pic:spPr bwMode="auto">
+                    <a:xfrm>
+                      <a:off x="0" y="0"/>
+                      <a:ext cx="5334000" cy="2945452"/>
+                    </a:xfrm>
+                    <a:prstGeom prst="rect">
+                      <a:avLst/>
+                    </a:prstGeom>
+                    <a:noFill/>
+                    <a:ln w="9525">
+                      <a:noFill/>
+                      <a:headEnd/>
+                      <a:tailEnd/>
+                    </a:ln>
+                  </pic:spPr>
+                </pic:pic>
+              </a:graphicData>
+            </a:graphic>
+          </wp:inline>
+        </w:drawing>
+      </w:r>
+    </w:p>
+    <w:p>
+      <w:pPr>
+        <w:pStyle w:val="ImageCaption"/>
+      </w:pPr>
+      <w:r>
+        <w:t xml:space="preserve">Papéis, comunicação, exercícios e revisões mantêm a resposta a incidentes preparada.</w:t>
+      </w:r>
     </w:p>
     <w:p>
       <w:pPr>
@@ -13806,8 +14282,8 @@
         <w:t xml:space="preserve">Consulte os recursos oficiais do CIS para confirmar a linguagem e os critérios de avaliação.</w:t>
       </w:r>
     </w:p>
-    <w:bookmarkEnd w:id="46"/>
-    <w:bookmarkStart w:id="47" w:name="controle-18-testes-de-penetração"/>
+    <w:bookmarkEnd w:id="73"/>
+    <w:bookmarkStart w:id="74" w:name="controle-18-testes-de-penetração"/>
     <w:p>
       <w:pPr>
         <w:pStyle w:val="Heading1"/>
@@ -14265,8 +14741,8 @@
         <w:t xml:space="preserve">Consulte os recursos oficiais do CIS para confirmar a linguagem e os critérios de avaliação.</w:t>
       </w:r>
     </w:p>
-    <w:bookmarkEnd w:id="47"/>
-    <w:bookmarkStart w:id="64" w:name="ferramentas-de-código-aberto"/>
+    <w:bookmarkEnd w:id="74"/>
+    <w:bookmarkStart w:id="91" w:name="ferramentas-de-código-aberto"/>
     <w:p>
       <w:pPr>
         <w:pStyle w:val="Heading1"/>
@@ -14967,7 +15443,7 @@
         <w:t xml:space="preserve">Uma ferramenta pode apoiar Salvaguardas, mas não escolhe o Grupo de Implementação, não define tolerância ao risco, não garante cobertura completa, não substitui procedimentos ou revisão humana e não comprova conformidade por si só.</w:t>
       </w:r>
     </w:p>
-    <w:bookmarkStart w:id="48" w:name="cis-controls-navigator"/>
+    <w:bookmarkStart w:id="75" w:name="cis-controls-navigator"/>
     <w:p>
       <w:pPr>
         <w:pStyle w:val="Heading2"/>
@@ -14992,8 +15468,8 @@
         <w:t xml:space="preserve">Use a versão 8.1, selecione o Grupo de Implementação e os mapeamentos necessários e preserve a configuração exportada como evidência.</w:t>
       </w:r>
     </w:p>
-    <w:bookmarkEnd w:id="48"/>
-    <w:bookmarkStart w:id="49" w:name="cis-controls-assessment-specification"/>
+    <w:bookmarkEnd w:id="75"/>
+    <w:bookmarkStart w:id="76" w:name="cis-controls-assessment-specification"/>
     <w:p>
       <w:pPr>
         <w:pStyle w:val="Heading2"/>
@@ -15018,8 +15494,8 @@
         <w:t xml:space="preserve">Identifique entradas, premissas, operações, medidas, métricas e revisão de procedimentos para cada Salvaguarda avaliada.</w:t>
       </w:r>
     </w:p>
-    <w:bookmarkEnd w:id="49"/>
-    <w:bookmarkStart w:id="50" w:name="cis-cat-lite"/>
+    <w:bookmarkEnd w:id="76"/>
+    <w:bookmarkStart w:id="77" w:name="cis-cat-lite"/>
     <w:p>
       <w:pPr>
         <w:pStyle w:val="Heading2"/>
@@ -15044,8 +15520,8 @@
         <w:t xml:space="preserve">Execute somente em sistemas autorizados, preserve o relatório, valide achados, corrija e reavalie.</w:t>
       </w:r>
     </w:p>
-    <w:bookmarkEnd w:id="50"/>
-    <w:bookmarkStart w:id="51" w:name="ciso-assistant"/>
+    <w:bookmarkEnd w:id="77"/>
+    <w:bookmarkStart w:id="78" w:name="ciso-assistant"/>
     <w:p>
       <w:pPr>
         <w:pStyle w:val="Heading2"/>
@@ -15070,8 +15546,8 @@
         <w:t xml:space="preserve">Crie um projeto com escopo definido, atribua responsáveis, anexe evidências e acompanhe achados e ações.</w:t>
       </w:r>
     </w:p>
-    <w:bookmarkEnd w:id="51"/>
-    <w:bookmarkStart w:id="52" w:name="wazuh"/>
+    <w:bookmarkEnd w:id="78"/>
+    <w:bookmarkStart w:id="79" w:name="wazuh"/>
     <w:p>
       <w:pPr>
         <w:pStyle w:val="Heading2"/>
@@ -15096,8 +15572,8 @@
         <w:t xml:space="preserve">Inscreva endpoints autorizados, gere eventos seguros de teste, confirme coleta e alertas e preserve evidências de cobertura e resposta.</w:t>
       </w:r>
     </w:p>
-    <w:bookmarkEnd w:id="52"/>
-    <w:bookmarkStart w:id="53" w:name="osquery"/>
+    <w:bookmarkEnd w:id="79"/>
+    <w:bookmarkStart w:id="80" w:name="osquery"/>
     <w:p>
       <w:pPr>
         <w:pStyle w:val="Heading2"/>
@@ -15122,8 +15598,8 @@
         <w:t xml:space="preserve">Execute consultas somente leitura em laboratório ou ambiente autorizado e compare resultados com inventários aprovados.</w:t>
       </w:r>
     </w:p>
-    <w:bookmarkEnd w:id="53"/>
-    <w:bookmarkStart w:id="54" w:name="openscap"/>
+    <w:bookmarkEnd w:id="80"/>
+    <w:bookmarkStart w:id="81" w:name="openscap"/>
     <w:p>
       <w:pPr>
         <w:pStyle w:val="Heading2"/>
@@ -15148,8 +15624,8 @@
         <w:t xml:space="preserve">Selecione um perfil apropriado, avalie sistemas autorizados, valide resultados, documente exceções e repita a avaliação.</w:t>
       </w:r>
     </w:p>
-    <w:bookmarkEnd w:id="54"/>
-    <w:bookmarkStart w:id="55" w:name="lynis"/>
+    <w:bookmarkEnd w:id="81"/>
+    <w:bookmarkStart w:id="82" w:name="lynis"/>
     <w:p>
       <w:pPr>
         <w:pStyle w:val="Heading2"/>
@@ -15174,8 +15650,8 @@
         <w:t xml:space="preserve">Audite hosts autorizados, compare os resultados com padrões aprovados e documente correções e novos testes.</w:t>
       </w:r>
     </w:p>
-    <w:bookmarkEnd w:id="55"/>
-    <w:bookmarkStart w:id="56" w:name="nmap"/>
+    <w:bookmarkEnd w:id="82"/>
+    <w:bookmarkStart w:id="83" w:name="nmap"/>
     <w:p>
       <w:pPr>
         <w:pStyle w:val="Heading2"/>
@@ -15200,8 +15676,8 @@
         <w:t xml:space="preserve">Utilize varreduras limitadas a intervalos autorizados por escrito e preserve escopo, comandos, resultados e conciliação.</w:t>
       </w:r>
     </w:p>
-    <w:bookmarkEnd w:id="56"/>
-    <w:bookmarkStart w:id="57" w:name="greenbone-community-edition"/>
+    <w:bookmarkEnd w:id="83"/>
+    <w:bookmarkStart w:id="84" w:name="greenbone-community-edition"/>
     <w:p>
       <w:pPr>
         <w:pStyle w:val="Heading2"/>
@@ -15226,8 +15702,8 @@
         <w:t xml:space="preserve">Atualize feeds, utilize alvos autorizados, valide cobertura, corrija achados e execute nova varredura.</w:t>
       </w:r>
     </w:p>
-    <w:bookmarkEnd w:id="57"/>
-    <w:bookmarkStart w:id="58" w:name="trivy"/>
+    <w:bookmarkEnd w:id="84"/>
+    <w:bookmarkStart w:id="85" w:name="trivy"/>
     <w:p>
       <w:pPr>
         <w:pStyle w:val="Heading2"/>
@@ -15252,8 +15728,8 @@
         <w:t xml:space="preserve">Analise repositórios ou imagens autorizados, valide achados, documente exceções e repita a análise após correções.</w:t>
       </w:r>
     </w:p>
-    <w:bookmarkEnd w:id="58"/>
-    <w:bookmarkStart w:id="59" w:name="owasp-zap"/>
+    <w:bookmarkEnd w:id="85"/>
+    <w:bookmarkStart w:id="86" w:name="owasp-zap"/>
     <w:p>
       <w:pPr>
         <w:pStyle w:val="Heading2"/>
@@ -15278,8 +15754,8 @@
         <w:t xml:space="preserve">Utilize aplicações de treinamento ou aplicações autorizadas; execute testes ativos somente com aprovação explícita.</w:t>
       </w:r>
     </w:p>
-    <w:bookmarkEnd w:id="59"/>
-    <w:bookmarkStart w:id="60" w:name="suricata"/>
+    <w:bookmarkEnd w:id="86"/>
+    <w:bookmarkStart w:id="87" w:name="suricata"/>
     <w:p>
       <w:pPr>
         <w:pStyle w:val="Heading2"/>
@@ -15304,8 +15780,8 @@
         <w:t xml:space="preserve">Use sensores autorizados, valide interfaces e regras, gere tráfego de teste aprovado e ajuste alertas com controle de mudanças.</w:t>
       </w:r>
     </w:p>
-    <w:bookmarkEnd w:id="60"/>
-    <w:bookmarkStart w:id="61" w:name="keycloak"/>
+    <w:bookmarkEnd w:id="87"/>
+    <w:bookmarkStart w:id="88" w:name="keycloak"/>
     <w:p>
       <w:pPr>
         <w:pStyle w:val="Heading2"/>
@@ -15330,8 +15806,8 @@
         <w:t xml:space="preserve">Configure um ambiente de laboratório, funções, MFA e eventos e teste cenários de entrada, mudança e saída de usuários.</w:t>
       </w:r>
     </w:p>
-    <w:bookmarkEnd w:id="61"/>
-    <w:bookmarkStart w:id="62" w:name="defectdojo"/>
+    <w:bookmarkEnd w:id="88"/>
+    <w:bookmarkStart w:id="89" w:name="defectdojo"/>
     <w:p>
       <w:pPr>
         <w:pStyle w:val="Heading2"/>
@@ -15356,8 +15832,8 @@
         <w:t xml:space="preserve">Importe resultados autorizados, valide deduplicação, atribua responsáveis e encerre achados somente após reteste confirmado.</w:t>
       </w:r>
     </w:p>
-    <w:bookmarkEnd w:id="62"/>
-    <w:bookmarkStart w:id="63" w:name="velociraptor"/>
+    <w:bookmarkEnd w:id="89"/>
+    <w:bookmarkStart w:id="90" w:name="velociraptor"/>
     <w:p>
       <w:pPr>
         <w:pStyle w:val="Heading2"/>
@@ -15382,9 +15858,9 @@
         <w:t xml:space="preserve">Utilize apenas ambientes autorizados, limite a coleta ao necessário e proteja os dados obtidos.</w:t>
       </w:r>
     </w:p>
-    <w:bookmarkEnd w:id="63"/>
-    <w:bookmarkEnd w:id="64"/>
-    <w:bookmarkStart w:id="65" w:name="guia-dos-cis-controls-para-gestores"/>
+    <w:bookmarkEnd w:id="90"/>
+    <w:bookmarkEnd w:id="91"/>
+    <w:bookmarkStart w:id="92" w:name="guia-dos-cis-controls-para-gestores"/>
     <w:p>
       <w:pPr>
         <w:pStyle w:val="Heading1"/>
@@ -15859,8 +16335,8 @@
         </w:tc>
       </w:tr>
     </w:tbl>
-    <w:bookmarkEnd w:id="65"/>
-    <w:bookmarkStart w:id="67" w:name="Xe2e4e599cd86a21a3d48c395761cd8e4c5b2cad"/>
+    <w:bookmarkEnd w:id="92"/>
+    <w:bookmarkStart w:id="97" w:name="Xe2e4e599cd86a21a3d48c395761cd8e4c5b2cad"/>
     <w:p>
       <w:pPr>
         <w:pStyle w:val="Heading1"/>
@@ -15883,26 +16359,76 @@
     </w:p>
     <w:p>
       <w:pPr>
+        <w:pStyle w:val="CaptionedFigure"/>
+      </w:pPr>
+      <w:r>
+        <w:drawing>
+          <wp:inline>
+            <wp:extent cx="5334000" cy="2945452"/>
+            <wp:effectExtent b="0" l="0" r="0" t="0"/>
+            <wp:docPr descr="Aprender a estrutura, mapear Salvaguardas, medir evidências, relatar lacunas e construir um portfólio honesto." title="" id="94" name="Picture"/>
+            <a:graphic>
+              <a:graphicData uri="http://schemas.openxmlformats.org/drawingml/2006/picture">
+                <pic:pic>
+                  <pic:nvPicPr>
+                    <pic:cNvPr descr="media/image10.png" id="95" name="Picture"/>
+                    <pic:cNvPicPr>
+                      <a:picLocks noChangeArrowheads="1" noChangeAspect="1"/>
+                    </pic:cNvPicPr>
+                  </pic:nvPicPr>
+                  <pic:blipFill>
+                    <a:blip r:embed="rId93"/>
+                    <a:stretch>
+                      <a:fillRect/>
+                    </a:stretch>
+                  </pic:blipFill>
+                  <pic:spPr bwMode="auto">
+                    <a:xfrm>
+                      <a:off x="0" y="0"/>
+                      <a:ext cx="5334000" cy="2945452"/>
+                    </a:xfrm>
+                    <a:prstGeom prst="rect">
+                      <a:avLst/>
+                    </a:prstGeom>
+                    <a:noFill/>
+                    <a:ln w="9525">
+                      <a:noFill/>
+                      <a:headEnd/>
+                      <a:tailEnd/>
+                    </a:ln>
+                  </pic:spPr>
+                </pic:pic>
+              </a:graphicData>
+            </a:graphic>
+          </wp:inline>
+        </w:drawing>
+      </w:r>
+    </w:p>
+    <w:p>
+      <w:pPr>
+        <w:pStyle w:val="ImageCaption"/>
+      </w:pPr>
+      <w:r>
+        <w:t xml:space="preserve">Aprender a estrutura, mapear Salvaguardas, medir evidências, relatar lacunas e construir um portfólio honesto.</w:t>
+      </w:r>
+    </w:p>
+    <w:p>
+      <w:pPr>
         <w:pStyle w:val="BodyText"/>
       </w:pPr>
+      <w:r>
+        <w:t xml:space="preserve">Figura 10. Caminho profissional para analistas juniores de CIS Controls</w:t>
+      </w:r>
     </w:p>
     <w:p>
       <w:pPr>
         <w:pStyle w:val="BodyText"/>
       </w:pPr>
       <w:r>
-        <w:t xml:space="preserve">Figura 10. Caminho profissional para analistas juniores de CIS Controls</w:t>
-      </w:r>
-    </w:p>
-    <w:p>
-      <w:pPr>
-        <w:pStyle w:val="BodyText"/>
-      </w:pPr>
-      <w:r>
         <w:t xml:space="preserve">Funções comuns incluem analista júnior de controles de segurança, analista de GRC, analista de gestão de vulnerabilidades, analista de garantia de segurança, analista de operações de segurança, analista de conformidade de TI, analista de risco de terceiros e analista de programa de cibersegurança.</w:t>
       </w:r>
     </w:p>
-    <w:bookmarkStart w:id="66" w:name="trabalho-júnior-típico"/>
+    <w:bookmarkStart w:id="96" w:name="trabalho-júnior-típico"/>
     <w:p>
       <w:pPr>
         <w:pStyle w:val="Heading2"/>
@@ -16218,9 +16744,9 @@
         </w:tc>
       </w:tr>
     </w:tbl>
-    <w:bookmarkEnd w:id="66"/>
-    <w:bookmarkEnd w:id="67"/>
-    <w:bookmarkStart w:id="71" w:name="laboratório-fictício-e-portfólio"/>
+    <w:bookmarkEnd w:id="96"/>
+    <w:bookmarkEnd w:id="97"/>
+    <w:bookmarkStart w:id="101" w:name="laboratório-fictício-e-portfólio"/>
     <w:p>
       <w:pPr>
         <w:pStyle w:val="Heading1"/>
@@ -16241,7 +16767,7 @@
         <w:t xml:space="preserve">Um exercício autorizado para demonstrar inventário, medição, correção e reteste sem expor dados reais.</w:t>
       </w:r>
     </w:p>
-    <w:bookmarkStart w:id="68" w:name="cenário"/>
+    <w:bookmarkStart w:id="98" w:name="cenário"/>
     <w:p>
       <w:pPr>
         <w:pStyle w:val="Heading2"/>
@@ -16258,8 +16784,8 @@
         <w:t xml:space="preserve">Crie uma organização fictícia de 50 pessoas com laptops, servidores, serviços em nuvem, uma aplicação web, trabalho remoto e cinco prestadores de serviços. Use somente dados sintéticos, ativos de laboratório e sistemas para os quais exista autorização explícita.</w:t>
       </w:r>
     </w:p>
-    <w:bookmarkEnd w:id="68"/>
-    <w:bookmarkStart w:id="69" w:name="etapas-do-laboratório"/>
+    <w:bookmarkEnd w:id="98"/>
+    <w:bookmarkStart w:id="99" w:name="etapas-do-laboratório"/>
     <w:p>
       <w:pPr>
         <w:pStyle w:val="Heading2"/>
@@ -16388,8 +16914,8 @@
         <w:t xml:space="preserve">Publique somente artefatos higienizados e declare claramente que o projeto é fictício e não constitui uma avaliação formal do CIS.</w:t>
       </w:r>
     </w:p>
-    <w:bookmarkEnd w:id="69"/>
-    <w:bookmarkStart w:id="70" w:name="artefatos-de-portfólio"/>
+    <w:bookmarkEnd w:id="99"/>
+    <w:bookmarkStart w:id="100" w:name="artefatos-de-portfólio"/>
     <w:p>
       <w:pPr>
         <w:pStyle w:val="Heading2"/>
@@ -16595,9 +17121,9 @@
         </w:tc>
       </w:tr>
     </w:tbl>
-    <w:bookmarkEnd w:id="70"/>
-    <w:bookmarkEnd w:id="71"/>
-    <w:bookmarkStart w:id="72" w:name="plano-de-aprendizagem-de-trinta-dias"/>
+    <w:bookmarkEnd w:id="100"/>
+    <w:bookmarkEnd w:id="101"/>
+    <w:bookmarkStart w:id="102" w:name="plano-de-aprendizagem-de-trinta-dias"/>
     <w:p>
       <w:pPr>
         <w:pStyle w:val="Heading1"/>
@@ -16976,8 +17502,8 @@
         </w:tc>
       </w:tr>
     </w:tbl>
-    <w:bookmarkEnd w:id="72"/>
-    <w:bookmarkStart w:id="82" w:name="preparação-para-entrevistas"/>
+    <w:bookmarkEnd w:id="102"/>
+    <w:bookmarkStart w:id="112" w:name="preparação-para-entrevistas"/>
     <w:p>
       <w:pPr>
         <w:pStyle w:val="Heading1"/>
@@ -16986,7 +17512,7 @@
         <w:t xml:space="preserve">29. Preparação para entrevistas</w:t>
       </w:r>
     </w:p>
-    <w:bookmarkStart w:id="73" w:name="como-explicar-os-cis-controls"/>
+    <w:bookmarkStart w:id="103" w:name="como-explicar-os-cis-controls"/>
     <w:p>
       <w:pPr>
         <w:pStyle w:val="Heading2"/>
@@ -17003,8 +17529,8 @@
         <w:t xml:space="preserve">Os CIS Controls são um conjunto priorizado de boas práticas de cibersegurança organizado em 18 Controles e 153 Salvaguardas. Eles ajudam a transformar objetivos defensivos em ações atribuíveis e mensuráveis, priorizadas pelos Grupos de Implementação.</w:t>
       </w:r>
     </w:p>
-    <w:bookmarkEnd w:id="73"/>
-    <w:bookmarkStart w:id="74" w:name="o-que-é-o-ig1"/>
+    <w:bookmarkEnd w:id="103"/>
+    <w:bookmarkStart w:id="104" w:name="o-que-é-o-ig1"/>
     <w:p>
       <w:pPr>
         <w:pStyle w:val="Heading2"/>
@@ -17021,8 +17547,8 @@
         <w:t xml:space="preserve">O IG1 contém 56 Salvaguardas e representa a higiene cibernética essencial. É o ponto de partida recomendado, mas a organização deve acrescentar Salvaguardas quando risco, obrigações, dados, serviços ou ameaças exigirem proteção adicional.</w:t>
       </w:r>
     </w:p>
-    <w:bookmarkEnd w:id="74"/>
-    <w:bookmarkStart w:id="75" w:name="o-ig1-atende-a-todos-os-requisitos"/>
+    <w:bookmarkEnd w:id="104"/>
+    <w:bookmarkStart w:id="105" w:name="o-ig1-atende-a-todos-os-requisitos"/>
     <w:p>
       <w:pPr>
         <w:pStyle w:val="Heading2"/>
@@ -17039,8 +17565,8 @@
         <w:t xml:space="preserve">Não. Um Grupo de Implementação é um mecanismo de priorização, não uma autorização para ignorar leis, contratos, requisitos setoriais ou riscos materiais.</w:t>
       </w:r>
     </w:p>
-    <w:bookmarkEnd w:id="75"/>
-    <w:bookmarkStart w:id="76" w:name="como-medir-uma-salvaguarda"/>
+    <w:bookmarkEnd w:id="105"/>
+    <w:bookmarkStart w:id="106" w:name="como-medir-uma-salvaguarda"/>
     <w:p>
       <w:pPr>
         <w:pStyle w:val="Heading2"/>
@@ -17057,8 +17583,8 @@
         <w:t xml:space="preserve">Defina a população aplicável, valide as entradas, execute operações repetíveis, produza medidas, calcule métricas, examine exceções e revise o procedimento. Preserve a evidência que sustenta a conclusão.</w:t>
       </w:r>
     </w:p>
-    <w:bookmarkEnd w:id="76"/>
-    <w:bookmarkStart w:id="77" w:name="Xcde025481064a1d89a437050ecd09a67b81ac43"/>
+    <w:bookmarkEnd w:id="106"/>
+    <w:bookmarkStart w:id="107" w:name="Xcde025481064a1d89a437050ecd09a67b81ac43"/>
     <w:p>
       <w:pPr>
         <w:pStyle w:val="Heading2"/>
@@ -17075,8 +17601,8 @@
         <w:t xml:space="preserve">Uma ferramenta pode apoiar uma Salvaguarda, mas não substitui escopo, processo, responsáveis, configuração, tratamento de exceções, medição, revisão humana ou melhoria contínua.</w:t>
       </w:r>
     </w:p>
-    <w:bookmarkEnd w:id="77"/>
-    <w:bookmarkStart w:id="78" w:name="como-tratar-uma-exceção"/>
+    <w:bookmarkEnd w:id="107"/>
+    <w:bookmarkStart w:id="108" w:name="como-tratar-uma-exceção"/>
     <w:p>
       <w:pPr>
         <w:pStyle w:val="Heading2"/>
@@ -17093,8 +17619,8 @@
         <w:t xml:space="preserve">Documente o ativo ou população afetada, justificativa, risco, controles compensatórios, responsável, aprovação, prazo e critério de revisão. Exceções não devem desaparecer dentro de uma porcentagem agregada.</w:t>
       </w:r>
     </w:p>
-    <w:bookmarkEnd w:id="78"/>
-    <w:bookmarkStart w:id="79" w:name="como-apresentar-um-achado"/>
+    <w:bookmarkEnd w:id="108"/>
+    <w:bookmarkStart w:id="109" w:name="como-apresentar-um-achado"/>
     <w:p>
       <w:pPr>
         <w:pStyle w:val="Heading2"/>
@@ -17111,8 +17637,8 @@
         <w:t xml:space="preserve">Explique o critério, a condição observada, a população afetada, o risco, a causa provável, a recomendação, o responsável, o prazo e o método de reteste.</w:t>
       </w:r>
     </w:p>
-    <w:bookmarkEnd w:id="79"/>
-    <w:bookmarkStart w:id="80" w:name="como-evitar-alegações-excessivas"/>
+    <w:bookmarkEnd w:id="109"/>
+    <w:bookmarkStart w:id="110" w:name="como-evitar-alegações-excessivas"/>
     <w:p>
       <w:pPr>
         <w:pStyle w:val="Heading2"/>
@@ -17129,8 +17655,8 @@
         <w:t xml:space="preserve">Diferencie implementação, desenho, operação, teste e conformidade. Declare escopo, período, limitações, fontes e dependências. Um mapeamento ou uma ferramenta não comprova automaticamente conformidade.</w:t>
       </w:r>
     </w:p>
-    <w:bookmarkEnd w:id="80"/>
-    <w:bookmarkStart w:id="81" w:name="perguntas-para-fazer-ao-empregador"/>
+    <w:bookmarkEnd w:id="110"/>
+    <w:bookmarkStart w:id="111" w:name="perguntas-para-fazer-ao-empregador"/>
     <w:p>
       <w:pPr>
         <w:pStyle w:val="Heading2"/>
@@ -17211,9 +17737,9 @@
         <w:t xml:space="preserve">Como prestadores de serviços fornecem evidências e notificam incidentes?</w:t>
       </w:r>
     </w:p>
-    <w:bookmarkEnd w:id="81"/>
-    <w:bookmarkEnd w:id="82"/>
-    <w:bookmarkStart w:id="88" w:name="modelos-glossário-índice-e-referências"/>
+    <w:bookmarkEnd w:id="111"/>
+    <w:bookmarkEnd w:id="112"/>
+    <w:bookmarkStart w:id="118" w:name="modelos-glossário-índice-e-referências"/>
     <w:p>
       <w:pPr>
         <w:pStyle w:val="Heading1"/>
@@ -17222,7 +17748,7 @@
         <w:t xml:space="preserve">30. Modelos, glossário, índice e referências</w:t>
       </w:r>
     </w:p>
-    <w:bookmarkStart w:id="83" w:name="modelo-de-papel-de-trabalho"/>
+    <w:bookmarkStart w:id="113" w:name="modelo-de-papel-de-trabalho"/>
     <w:p>
       <w:pPr>
         <w:pStyle w:val="Heading2"/>
@@ -17506,8 +18032,8 @@
         </w:tc>
       </w:tr>
     </w:tbl>
-    <w:bookmarkEnd w:id="83"/>
-    <w:bookmarkStart w:id="84" w:name="registro-de-achados-e-retestes"/>
+    <w:bookmarkEnd w:id="113"/>
+    <w:bookmarkStart w:id="114" w:name="registro-de-achados-e-retestes"/>
     <w:p>
       <w:pPr>
         <w:pStyle w:val="Heading2"/>
@@ -17733,8 +18259,8 @@
         </w:tc>
       </w:tr>
     </w:tbl>
-    <w:bookmarkEnd w:id="84"/>
-    <w:bookmarkStart w:id="85" w:name="glossário"/>
+    <w:bookmarkEnd w:id="114"/>
+    <w:bookmarkStart w:id="115" w:name="glossário"/>
     <w:p>
       <w:pPr>
         <w:pStyle w:val="Heading2"/>
@@ -18096,8 +18622,8 @@
         </w:tc>
       </w:tr>
     </w:tbl>
-    <w:bookmarkEnd w:id="85"/>
-    <w:bookmarkStart w:id="86" w:name="índice-de-assuntos"/>
+    <w:bookmarkEnd w:id="115"/>
+    <w:bookmarkStart w:id="116" w:name="índice-de-assuntos"/>
     <w:p>
       <w:pPr>
         <w:pStyle w:val="Heading2"/>
@@ -18238,8 +18764,8 @@
         <w:t xml:space="preserve">Vulnerabilidades: Controle 7.</w:t>
       </w:r>
     </w:p>
-    <w:bookmarkEnd w:id="86"/>
-    <w:bookmarkStart w:id="87" w:name="referências-oficiais"/>
+    <w:bookmarkEnd w:id="116"/>
+    <w:bookmarkStart w:id="117" w:name="referências-oficiais"/>
     <w:p>
       <w:pPr>
         <w:pStyle w:val="Heading2"/>
@@ -18314,8 +18840,8 @@
         <w:t xml:space="preserve">Estruturas, mapeamentos, ferramentas, produtos, ameaças, leis, contratos e riscos organizacionais mudam. Confirme sempre os recursos oficiais atuais e as obrigações aplicáveis antes de implementar, avaliar ou publicar conclusões.</w:t>
       </w:r>
     </w:p>
-    <w:bookmarkEnd w:id="87"/>
-    <w:bookmarkEnd w:id="88"/>
+    <w:bookmarkEnd w:id="117"/>
+    <w:bookmarkEnd w:id="118"/>
     <w:sectPr/>
   </w:body>
 </w:document>

</xml_diff>